<commit_message>
Remove the placeholder note from the head of Chapter 5
Requested. Chapter 5 now opens straight on Section 5.1. The yellow
highlighting on every figure, pupil code and quotation stays, and rows 8
to 11 of the pre-submission checklist still record that those values are
to be replaced with the writers' own data.

Co-Authored-By: Claude Opus 5 <noreply@anthropic.com>
Claude-Session: https://claude.ai/code/session_01KHo5ZcKCUwhCAvyoKeeMWs
</commit_message>
<xml_diff>
--- a/didactics-seminar/Educational_Games_Reading_Comprehension_seminar.docx
+++ b/didactics-seminar/Educational_Games_Reading_Comprehension_seminar.docx
@@ -3184,25 +3184,6 @@
       </w:pPr>
       <w:r>
         <w:t xml:space="preserve">5. Results</w:t>
-      </w:r>
-    </w:p>
-    <w:p>
-      <w:pPr>
-        <w:pBdr>
-          <w:left w:val="single" w:color="C00000" w:sz="12" w:space="8"/>
-        </w:pBdr>
-        <w:spacing w:after="240"/>
-      </w:pPr>
-      <w:r>
-        <w:rPr>
-          <w:rFonts w:ascii="Times New Roman" w:cs="Times New Roman" w:eastAsia="Times New Roman" w:hAnsi="Times New Roman"/>
-          <w:i/>
-          <w:iCs/>
-          <w:color w:val="C00000"/>
-          <w:sz w:val="22"/>
-          <w:szCs w:val="22"/>
-        </w:rPr>
-        <w:t xml:space="preserve">Note to the writers (delete before submission): Every figure, pupil code and quotation in Chapters 5, 6 and 7 is highlighted in yellow. They are illustrative placeholders, written so that the chapters read as finished prose, and each one has to be replaced with the value from your own response sheets, checklists and field notes before the paper is submitted. The figures are internally consistent: each row of Table 1 sums to 20, each station total in Table 2 obeys the scoring rules in Appendix F, and every observation count is out of the 16 station visits. When you change one figure, check the sentences that depend on it, and do not submit the paper with any highlight left in it.</w:t>
       </w:r>
     </w:p>
     <w:p>

</xml_diff>